<commit_message>
docs: synchronize canonical audit evidence
</commit_message>
<xml_diff>
--- a/docs/SALIS_AUTO_CANONICAL_AUDIT_2026-06-10.docx
+++ b/docs/SALIS_AUTO_CANONICAL_AUDIT_2026-06-10.docx
@@ -4934,14 +4934,7 @@
             </w:tcMar>
           </w:tcPr>
           <w:p>
-            <w:pPr>
-              <w:spacing w:after="0" w:line="252" w:lineRule="auto"/>
-            </w:pPr>
             <w:r>
-              <w:rPr>
-                <w:rFonts w:ascii="Calibri" w:hAnsi="Calibri"/>
-                <w:sz w:val="16"/>
-              </w:rPr>
               <w:t>High</w:t>
             </w:r>
           </w:p>
@@ -4958,15 +4951,8 @@
             </w:tcMar>
           </w:tcPr>
           <w:p>
-            <w:pPr>
-              <w:spacing w:after="0" w:line="252" w:lineRule="auto"/>
-            </w:pPr>
             <w:r>
-              <w:rPr>
-                <w:rFonts w:ascii="Calibri" w:hAnsi="Calibri"/>
-                <w:sz w:val="16"/>
-              </w:rPr>
-              <w:t>Authentication baseline improved; retain remaining RBAC and tenant acceptance items</w:t>
+              <w:t>Canonical report establishes a source of truth; retain status-document consolidation and ownership</w:t>
             </w:r>
           </w:p>
         </w:tc>
@@ -5010,15 +4996,8 @@
             </w:tcMar>
           </w:tcPr>
           <w:p>
-            <w:pPr>
-              <w:spacing w:after="0" w:line="252" w:lineRule="auto"/>
-            </w:pPr>
             <w:r>
-              <w:rPr>
-                <w:rFonts w:ascii="Calibri" w:hAnsi="Calibri"/>
-                <w:sz w:val="16"/>
-              </w:rPr>
-              <w:t>High</w:t>
+              <w:t>Critical</w:t>
             </w:r>
           </w:p>
         </w:tc>
@@ -5035,15 +5014,8 @@
             </w:tcMar>
           </w:tcPr>
           <w:p>
-            <w:pPr>
-              <w:spacing w:after="0" w:line="252" w:lineRule="auto"/>
-            </w:pPr>
             <w:r>
-              <w:rPr>
-                <w:rFonts w:ascii="Calibri" w:hAnsi="Calibri"/>
-                <w:sz w:val="16"/>
-              </w:rPr>
-              <w:t>CI runs, but deterministic install and protected required checks remain release gates</w:t>
+              <w:t>Typecheck/build design is verified locally; workflow publication, ESLint configuration, and required checks remain</w:t>
             </w:r>
           </w:p>
         </w:tc>
@@ -5085,15 +5057,8 @@
             </w:tcMar>
           </w:tcPr>
           <w:p>
-            <w:pPr>
-              <w:spacing w:after="0" w:line="252" w:lineRule="auto"/>
-            </w:pPr>
             <w:r>
-              <w:rPr>
-                <w:rFonts w:ascii="Calibri" w:hAnsi="Calibri"/>
-                <w:sz w:val="16"/>
-              </w:rPr>
-              <w:t>Medium</w:t>
+              <w:t>High</w:t>
             </w:r>
           </w:p>
         </w:tc>
@@ -5109,15 +5074,8 @@
             </w:tcMar>
           </w:tcPr>
           <w:p>
-            <w:pPr>
-              <w:spacing w:after="0" w:line="252" w:lineRule="auto"/>
-            </w:pPr>
             <w:r>
-              <w:rPr>
-                <w:rFonts w:ascii="Calibri" w:hAnsi="Calibri"/>
-                <w:sz w:val="16"/>
-              </w:rPr>
-              <w:t>Retain architecture decomposition with measurable migration targets</w:t>
+              <w:t>Retain the verified 60-file @ts-nocheck burn-down with risk-based sequencing</w:t>
             </w:r>
           </w:p>
         </w:tc>
@@ -5161,14 +5119,7 @@
             </w:tcMar>
           </w:tcPr>
           <w:p>
-            <w:pPr>
-              <w:spacing w:after="0" w:line="252" w:lineRule="auto"/>
-            </w:pPr>
             <w:r>
-              <w:rPr>
-                <w:rFonts w:ascii="Calibri" w:hAnsi="Calibri"/>
-                <w:sz w:val="16"/>
-              </w:rPr>
               <w:t>High</w:t>
             </w:r>
           </w:p>
@@ -5186,15 +5137,8 @@
             </w:tcMar>
           </w:tcPr>
           <w:p>
-            <w:pPr>
-              <w:spacing w:after="0" w:line="252" w:lineRule="auto"/>
-            </w:pPr>
             <w:r>
-              <w:rPr>
-                <w:rFonts w:ascii="Calibri" w:hAnsi="Calibri"/>
-                <w:sz w:val="16"/>
-              </w:rPr>
-              <w:t>Test infrastructure exists; retain critical-path and negative authorization coverage</w:t>
+              <w:t>Render secret declaration is prepared; retain environment documentation and deployment smoke-test evidence</w:t>
             </w:r>
           </w:p>
         </w:tc>
@@ -5236,14 +5180,7 @@
             </w:tcMar>
           </w:tcPr>
           <w:p>
-            <w:pPr>
-              <w:spacing w:after="0" w:line="252" w:lineRule="auto"/>
-            </w:pPr>
             <w:r>
-              <w:rPr>
-                <w:rFonts w:ascii="Calibri" w:hAnsi="Calibri"/>
-                <w:sz w:val="16"/>
-              </w:rPr>
               <w:t>Critical</w:t>
             </w:r>
           </w:p>
@@ -5260,14 +5197,7 @@
             </w:tcMar>
           </w:tcPr>
           <w:p>
-            <w:pPr>
-              <w:spacing w:after="0" w:line="252" w:lineRule="auto"/>
-            </w:pPr>
             <w:r>
-              <w:rPr>
-                <w:rFonts w:ascii="Calibri" w:hAnsi="Calibri"/>
-                <w:sz w:val="16"/>
-              </w:rPr>
               <w:t>Retain ZATCA production integration and certification work</w:t>
             </w:r>
           </w:p>
@@ -5312,14 +5242,7 @@
             </w:tcMar>
           </w:tcPr>
           <w:p>
-            <w:pPr>
-              <w:spacing w:after="0" w:line="252" w:lineRule="auto"/>
-            </w:pPr>
             <w:r>
-              <w:rPr>
-                <w:rFonts w:ascii="Calibri" w:hAnsi="Calibri"/>
-                <w:sz w:val="16"/>
-              </w:rPr>
               <w:t>Critical</w:t>
             </w:r>
           </w:p>
@@ -5337,14 +5260,7 @@
             </w:tcMar>
           </w:tcPr>
           <w:p>
-            <w:pPr>
-              <w:spacing w:after="0" w:line="252" w:lineRule="auto"/>
-            </w:pPr>
             <w:r>
-              <w:rPr>
-                <w:rFonts w:ascii="Calibri" w:hAnsi="Calibri"/>
-                <w:sz w:val="16"/>
-              </w:rPr>
               <w:t>Retain production payment integration and reconciliation work</w:t>
             </w:r>
           </w:p>
@@ -5387,14 +5303,7 @@
             </w:tcMar>
           </w:tcPr>
           <w:p>
-            <w:pPr>
-              <w:spacing w:after="0" w:line="252" w:lineRule="auto"/>
-            </w:pPr>
             <w:r>
-              <w:rPr>
-                <w:rFonts w:ascii="Calibri" w:hAnsi="Calibri"/>
-                <w:sz w:val="16"/>
-              </w:rPr>
               <w:t>High</w:t>
             </w:r>
           </w:p>
@@ -5411,14 +5320,7 @@
             </w:tcMar>
           </w:tcPr>
           <w:p>
-            <w:pPr>
-              <w:spacing w:after="0" w:line="252" w:lineRule="auto"/>
-            </w:pPr>
             <w:r>
-              <w:rPr>
-                <w:rFonts w:ascii="Calibri" w:hAnsi="Calibri"/>
-                <w:sz w:val="16"/>
-              </w:rPr>
               <w:t>Retain finance completion and control validation</w:t>
             </w:r>
           </w:p>
@@ -5463,14 +5365,7 @@
             </w:tcMar>
           </w:tcPr>
           <w:p>
-            <w:pPr>
-              <w:spacing w:after="0" w:line="252" w:lineRule="auto"/>
-            </w:pPr>
             <w:r>
-              <w:rPr>
-                <w:rFonts w:ascii="Calibri" w:hAnsi="Calibri"/>
-                <w:sz w:val="16"/>
-              </w:rPr>
               <w:t>High</w:t>
             </w:r>
           </w:p>
@@ -5488,15 +5383,8 @@
             </w:tcMar>
           </w:tcPr>
           <w:p>
-            <w:pPr>
-              <w:spacing w:after="0" w:line="252" w:lineRule="auto"/>
-            </w:pPr>
             <w:r>
-              <w:rPr>
-                <w:rFonts w:ascii="Calibri" w:hAnsi="Calibri"/>
-                <w:sz w:val="16"/>
-              </w:rPr>
-              <w:t>Retain HR/payroll completion and regulatory validation</w:t>
+              <w:t>Retain estimate-to-invoice and job-card-to-invoice workflow completion</w:t>
             </w:r>
           </w:p>
         </w:tc>
@@ -5538,15 +5426,8 @@
             </w:tcMar>
           </w:tcPr>
           <w:p>
-            <w:pPr>
-              <w:spacing w:after="0" w:line="252" w:lineRule="auto"/>
-            </w:pPr>
             <w:r>
-              <w:rPr>
-                <w:rFonts w:ascii="Calibri" w:hAnsi="Calibri"/>
-                <w:sz w:val="16"/>
-              </w:rPr>
-              <w:t>Medium</w:t>
+              <w:t>High</w:t>
             </w:r>
           </w:p>
         </w:tc>
@@ -5562,15 +5443,8 @@
             </w:tcMar>
           </w:tcPr>
           <w:p>
-            <w:pPr>
-              <w:spacing w:after="0" w:line="252" w:lineRule="auto"/>
-            </w:pPr>
             <w:r>
-              <w:rPr>
-                <w:rFonts w:ascii="Calibri" w:hAnsi="Calibri"/>
-                <w:sz w:val="16"/>
-              </w:rPr>
-              <w:t>Retain customer experience wiring and ownership verification</w:t>
+              <w:t>Retain client-side and critical-path end-to-end coverage</w:t>
             </w:r>
           </w:p>
         </w:tc>
@@ -5614,15 +5488,8 @@
             </w:tcMar>
           </w:tcPr>
           <w:p>
-            <w:pPr>
-              <w:spacing w:after="0" w:line="252" w:lineRule="auto"/>
-            </w:pPr>
             <w:r>
-              <w:rPr>
-                <w:rFonts w:ascii="Calibri" w:hAnsi="Calibri"/>
-                <w:sz w:val="16"/>
-              </w:rPr>
-              <w:t>High</w:t>
+              <w:t>Medium</w:t>
             </w:r>
           </w:p>
         </w:tc>
@@ -5639,15 +5506,8 @@
             </w:tcMar>
           </w:tcPr>
           <w:p>
-            <w:pPr>
-              <w:spacing w:after="0" w:line="252" w:lineRule="auto"/>
-            </w:pPr>
             <w:r>
-              <w:rPr>
-                <w:rFonts w:ascii="Calibri" w:hAnsi="Calibri"/>
-                <w:sz w:val="16"/>
-              </w:rPr>
-              <w:t>Retain security hardening and adversarial tenant testing</w:t>
+              <w:t>Retain route decomposition with measurable legacy-router reduction</w:t>
             </w:r>
           </w:p>
         </w:tc>
@@ -5689,15 +5549,8 @@
             </w:tcMar>
           </w:tcPr>
           <w:p>
-            <w:pPr>
-              <w:spacing w:after="0" w:line="252" w:lineRule="auto"/>
-            </w:pPr>
             <w:r>
-              <w:rPr>
-                <w:rFonts w:ascii="Calibri" w:hAnsi="Calibri"/>
-                <w:sz w:val="16"/>
-              </w:rPr>
-              <w:t>Medium</w:t>
+              <w:t>Critical</w:t>
             </w:r>
           </w:p>
         </w:tc>
@@ -5713,15 +5566,8 @@
             </w:tcMar>
           </w:tcPr>
           <w:p>
-            <w:pPr>
-              <w:spacing w:after="0" w:line="252" w:lineRule="auto"/>
-            </w:pPr>
             <w:r>
-              <w:rPr>
-                <w:rFonts w:ascii="Calibri" w:hAnsi="Calibri"/>
-                <w:sz w:val="16"/>
-              </w:rPr>
-              <w:t>Retain performance baseline and observability requirements</w:t>
+              <w:t>Elevate RBAC enforcement and tenant-negative tests to a release gate</w:t>
             </w:r>
           </w:p>
         </w:tc>
@@ -5765,14 +5611,7 @@
             </w:tcMar>
           </w:tcPr>
           <w:p>
-            <w:pPr>
-              <w:spacing w:after="0" w:line="252" w:lineRule="auto"/>
-            </w:pPr>
             <w:r>
-              <w:rPr>
-                <w:rFonts w:ascii="Calibri" w:hAnsi="Calibri"/>
-                <w:sz w:val="16"/>
-              </w:rPr>
               <w:t>Medium</w:t>
             </w:r>
           </w:p>
@@ -5790,14 +5629,7 @@
             </w:tcMar>
           </w:tcPr>
           <w:p>
-            <w:pPr>
-              <w:spacing w:after="0" w:line="252" w:lineRule="auto"/>
-            </w:pPr>
             <w:r>
-              <w:rPr>
-                <w:rFonts w:ascii="Calibri" w:hAnsi="Calibri"/>
-                <w:sz w:val="16"/>
-              </w:rPr>
               <w:t>Retain repository hygiene and documentation consolidation</w:t>
             </w:r>
           </w:p>

</xml_diff>

<commit_message>
docs: record post-merge audit topology
</commit_message>
<xml_diff>
--- a/docs/SALIS_AUTO_CANONICAL_AUDIT_2026-06-10.docx
+++ b/docs/SALIS_AUTO_CANONICAL_AUDIT_2026-06-10.docx
@@ -637,15 +637,8 @@
             </w:tcMar>
           </w:tcPr>
           <w:p>
-            <w:pPr>
-              <w:spacing w:after="0" w:line="252" w:lineRule="auto"/>
-            </w:pPr>
             <w:r>
-              <w:rPr>
-                <w:rFonts w:ascii="Calibri" w:hAnsi="Calibri"/>
-                <w:sz w:val="16"/>
-              </w:rPr>
-              <w:t>Default branch; behind the large integration branch</w:t>
+              <w:t>Default branch; PR #6 merged into it on June 10, 2026</w:t>
             </w:r>
           </w:p>
         </w:tc>
@@ -662,15 +655,8 @@
             </w:tcMar>
           </w:tcPr>
           <w:p>
-            <w:pPr>
-              <w:spacing w:after="0" w:line="252" w:lineRule="auto"/>
-            </w:pPr>
             <w:r>
-              <w:rPr>
-                <w:rFonts w:ascii="Calibri" w:hAnsi="Calibri"/>
-                <w:sz w:val="16"/>
-              </w:rPr>
-              <w:t>Protected release trunk should be restored</w:t>
+              <w:t>Authoritative release trunk; protection remains required</w:t>
             </w:r>
           </w:p>
         </w:tc>
@@ -713,23 +699,8 @@
             </w:tcMar>
           </w:tcPr>
           <w:p>
-            <w:pPr>
-              <w:spacing w:after="0" w:line="252" w:lineRule="auto"/>
-            </w:pPr>
             <w:r>
-              <w:rPr>
-                <w:rFonts w:ascii="Calibri" w:hAnsi="Calibri"/>
-                <w:sz w:val="16"/>
-              </w:rPr>
-              <w:t xml:space="preserve">Broad integration branch at </w:t>
-            </w:r>
-            <w:r>
-              <w:rPr>
-                <w:rFonts w:ascii="Calibri" w:hAnsi="Calibri"/>
-                <w:color w:val="1F4D78"/>
-                <w:sz w:val="16"/>
-              </w:rPr>
-              <w:t>6c34e325</w:t>
+              <w:t>Audited implementation baseline at 6c34e325</w:t>
             </w:r>
           </w:p>
         </w:tc>
@@ -745,15 +716,8 @@
             </w:tcMar>
           </w:tcPr>
           <w:p>
-            <w:pPr>
-              <w:spacing w:after="0" w:line="252" w:lineRule="auto"/>
-            </w:pPr>
             <w:r>
-              <w:rPr>
-                <w:rFonts w:ascii="Calibri" w:hAnsi="Calibri"/>
-                <w:sz w:val="16"/>
-              </w:rPr>
-              <w:t>Current implementation baseline for this audit</w:t>
+              <w:t>Historical integration head; retire after dependent work is rebased</w:t>
             </w:r>
           </w:p>
         </w:tc>
@@ -798,15 +762,8 @@
             </w:tcMar>
           </w:tcPr>
           <w:p>
-            <w:pPr>
-              <w:spacing w:after="0" w:line="252" w:lineRule="auto"/>
-            </w:pPr>
             <w:r>
-              <w:rPr>
-                <w:rFonts w:ascii="Calibri" w:hAnsi="Calibri"/>
-                <w:sz w:val="16"/>
-              </w:rPr>
-              <w:t>Base of PR #6</w:t>
+              <w:t>Former base of PR #6</w:t>
             </w:r>
           </w:p>
         </w:tc>
@@ -823,15 +780,8 @@
             </w:tcMar>
           </w:tcPr>
           <w:p>
-            <w:pPr>
-              <w:spacing w:after="0" w:line="252" w:lineRule="auto"/>
-            </w:pPr>
             <w:r>
-              <w:rPr>
-                <w:rFonts w:ascii="Calibri" w:hAnsi="Calibri"/>
-                <w:sz w:val="16"/>
-              </w:rPr>
-              <w:t>Temporary review topology, not a durable trunk strategy</w:t>
+              <w:t>Temporary topology superseded by the merge to main</w:t>
             </w:r>
           </w:p>
         </w:tc>
@@ -997,29 +947,7 @@
     </w:p>
     <w:p>
       <w:r>
-        <w:t xml:space="preserve">PR #3 and PR #6 share the same long-lived head branch but advertise different scopes and bases. This makes review state ambiguous and allows unrelated changes to accumulate behind an obsolete title. PR #6 should be the sole integration PR and ultimately target </w:t>
-      </w:r>
-      <w:r>
-        <w:rPr>
-          <w:rFonts w:ascii="Consolas" w:hAnsi="Consolas"/>
-          <w:color w:val="1F4D78"/>
-          <w:sz w:val="19"/>
-        </w:rPr>
-        <w:t>main</w:t>
-      </w:r>
-      <w:r>
-        <w:t xml:space="preserve">; focused remediation should merge into </w:t>
-      </w:r>
-      <w:r>
-        <w:rPr>
-          <w:rFonts w:ascii="Consolas" w:hAnsi="Consolas"/>
-          <w:color w:val="1F4D78"/>
-          <w:sz w:val="19"/>
-        </w:rPr>
-        <w:t>pr-branch</w:t>
-      </w:r>
-      <w:r>
-        <w:t xml:space="preserve"> first.</w:t>
+        <w:t>PR #3 and PR #6 shared the same long-lived head branch but advertised different scopes and bases. PR #3 was closed as superseded, and PR #6 merged into main on June 10, 2026. PR #21 is now based on main. Issue #22 tracks the remaining branch-protection and canonical release-path controls.</w:t>
       </w:r>
     </w:p>
     <w:p>
@@ -4480,15 +4408,8 @@
             </w:tcMar>
           </w:tcPr>
           <w:p>
-            <w:pPr>
-              <w:spacing w:after="0" w:line="252" w:lineRule="auto"/>
-            </w:pPr>
             <w:r>
-              <w:rPr>
-                <w:rFonts w:ascii="Calibri" w:hAnsi="Calibri"/>
-                <w:sz w:val="16"/>
-              </w:rPr>
-              <w:t>Retain as canonical integration PR</w:t>
+              <w:t>Merged June 10, 2026</w:t>
             </w:r>
           </w:p>
         </w:tc>
@@ -4504,45 +4425,8 @@
             </w:tcMar>
           </w:tcPr>
           <w:p>
-            <w:pPr>
-              <w:spacing w:after="0" w:line="252" w:lineRule="auto"/>
-            </w:pPr>
             <w:r>
-              <w:rPr>
-                <w:rFonts w:ascii="Calibri" w:hAnsi="Calibri"/>
-                <w:sz w:val="16"/>
-              </w:rPr>
-              <w:t xml:space="preserve">It represents the current </w:t>
-            </w:r>
-            <w:r>
-              <w:rPr>
-                <w:rFonts w:ascii="Calibri" w:hAnsi="Calibri"/>
-                <w:color w:val="1F4D78"/>
-                <w:sz w:val="16"/>
-              </w:rPr>
-              <w:t>pr-branch</w:t>
-            </w:r>
-            <w:r>
-              <w:rPr>
-                <w:rFonts w:ascii="Calibri" w:hAnsi="Calibri"/>
-                <w:sz w:val="16"/>
-              </w:rPr>
-              <w:t xml:space="preserve">; retarget to </w:t>
-            </w:r>
-            <w:r>
-              <w:rPr>
-                <w:rFonts w:ascii="Calibri" w:hAnsi="Calibri"/>
-                <w:color w:val="1F4D78"/>
-                <w:sz w:val="16"/>
-              </w:rPr>
-              <w:t>main</w:t>
-            </w:r>
-            <w:r>
-              <w:rPr>
-                <w:rFonts w:ascii="Calibri" w:hAnsi="Calibri"/>
-                <w:sz w:val="16"/>
-              </w:rPr>
-              <w:t xml:space="preserve"> after focused remediation</w:t>
+              <w:t>Its broad integration state is now part of main; remaining launch gates are not implied fixed</w:t>
             </w:r>
           </w:p>
         </w:tc>
@@ -4712,15 +4596,8 @@
             </w:tcMar>
           </w:tcPr>
           <w:p>
-            <w:pPr>
-              <w:spacing w:after="0" w:line="252" w:lineRule="auto"/>
-            </w:pPr>
             <w:r>
-              <w:rPr>
-                <w:rFonts w:ascii="Calibri" w:hAnsi="Calibri"/>
-                <w:sz w:val="16"/>
-              </w:rPr>
-              <w:t>New remediation PR</w:t>
+              <w:t>#21</w:t>
             </w:r>
           </w:p>
         </w:tc>
@@ -4737,23 +4614,8 @@
             </w:tcMar>
           </w:tcPr>
           <w:p>
-            <w:pPr>
-              <w:spacing w:after="0" w:line="252" w:lineRule="auto"/>
-            </w:pPr>
             <w:r>
-              <w:rPr>
-                <w:rFonts w:ascii="Calibri" w:hAnsi="Calibri"/>
-                <w:sz w:val="16"/>
-              </w:rPr>
-              <w:t xml:space="preserve">Review and merge into </w:t>
-            </w:r>
-            <w:r>
-              <w:rPr>
-                <w:rFonts w:ascii="Calibri" w:hAnsi="Calibri"/>
-                <w:color w:val="1F4D78"/>
-                <w:sz w:val="16"/>
-              </w:rPr>
-              <w:t>pr-branch</w:t>
+              <w:t>Draft; review against main</w:t>
             </w:r>
           </w:p>
         </w:tc>
@@ -4770,15 +4632,8 @@
             </w:tcMar>
           </w:tcPr>
           <w:p>
-            <w:pPr>
-              <w:spacing w:after="0" w:line="252" w:lineRule="auto"/>
-            </w:pPr>
             <w:r>
-              <w:rPr>
-                <w:rFonts w:ascii="Calibri" w:hAnsi="Calibri"/>
-                <w:sz w:val="16"/>
-              </w:rPr>
-              <w:t>Isolated lockfile, CI, deployment-secret, and canonical-report changes</w:t>
+              <w:t>Canonical report and deployment-secret fix are published; workflow consolidation remains blocked on workflow-write scope</w:t>
             </w:r>
           </w:p>
         </w:tc>
@@ -5648,15 +5503,8 @@
             </w:tcMar>
           </w:tcPr>
           <w:p>
-            <w:pPr>
-              <w:spacing w:after="0" w:line="252" w:lineRule="auto"/>
-            </w:pPr>
             <w:r>
-              <w:rPr>
-                <w:rFonts w:ascii="Calibri" w:hAnsi="Calibri"/>
-                <w:sz w:val="16"/>
-              </w:rPr>
-              <w:t>New</w:t>
+              <w:t>#22</w:t>
             </w:r>
           </w:p>
         </w:tc>
@@ -5696,15 +5544,8 @@
             </w:tcMar>
           </w:tcPr>
           <w:p>
-            <w:pPr>
-              <w:spacing w:after="0" w:line="252" w:lineRule="auto"/>
-            </w:pPr>
             <w:r>
-              <w:rPr>
-                <w:rFonts w:ascii="Calibri" w:hAnsi="Calibri"/>
-                <w:sz w:val="16"/>
-              </w:rPr>
-              <w:t>Create branch-governance and release-trunk issue</w:t>
+              <w:t>Protected main, required checks, branch ownership, and one canonical release path</w:t>
             </w:r>
           </w:p>
         </w:tc>

</xml_diff>

<commit_message>
docs: correct canonical integration topology
</commit_message>
<xml_diff>
--- a/docs/SALIS_AUTO_CANONICAL_AUDIT_2026-06-10.docx
+++ b/docs/SALIS_AUTO_CANONICAL_AUDIT_2026-06-10.docx
@@ -638,7 +638,7 @@
           </w:tcPr>
           <w:p>
             <w:r>
-              <w:t>Default branch; PR #6 merged into it on June 10, 2026</w:t>
+              <w:t>Default branch; does not yet contain the broad PR #6 integration</w:t>
             </w:r>
           </w:p>
         </w:tc>
@@ -717,7 +717,7 @@
           </w:tcPr>
           <w:p>
             <w:r>
-              <w:t>Historical integration head; retire after dependent work is rebased</w:t>
+              <w:t>Canonical integration head; PR #23 exposes it to main</w:t>
             </w:r>
           </w:p>
         </w:tc>
@@ -763,7 +763,7 @@
           </w:tcPr>
           <w:p>
             <w:r>
-              <w:t>Former base of PR #6</w:t>
+              <w:t>PR #6 was merged here on June 10, 2026</w:t>
             </w:r>
           </w:p>
         </w:tc>
@@ -781,7 +781,7 @@
           </w:tcPr>
           <w:p>
             <w:r>
-              <w:t>Temporary topology superseded by the merge to main</w:t>
+              <w:t>Temporary review branch, not the release trunk</w:t>
             </w:r>
           </w:p>
         </w:tc>
@@ -947,7 +947,7 @@
     </w:p>
     <w:p>
       <w:r>
-        <w:t>PR #3 and PR #6 shared the same long-lived head branch but advertised different scopes and bases. PR #3 was closed as superseded, and PR #6 merged into main on June 10, 2026. PR #21 is now based on main. Issue #22 tracks the remaining branch-protection and canonical release-path controls.</w:t>
+        <w:t>PR #3 and PR #6 shared the same long-lived head branch but advertised different scopes and bases. PR #3 was closed as superseded, while PR #6 merged into the temporary review-base, not main. PR #21 remains a focused remediation PR into pr-branch; draft PR #23 is the canonical pr-branch to main integration path. Issue #22 tracks branch protection and release controls.</w:t>
       </w:r>
     </w:p>
     <w:p>
@@ -4409,7 +4409,7 @@
           </w:tcPr>
           <w:p>
             <w:r>
-              <w:t>Merged June 10, 2026</w:t>
+              <w:t>Merged into review-base June 10, 2026</w:t>
             </w:r>
           </w:p>
         </w:tc>
@@ -4426,7 +4426,7 @@
           </w:tcPr>
           <w:p>
             <w:r>
-              <w:t>Its broad integration state is now part of main; remaining launch gates are not implied fixed</w:t>
+              <w:t>The broad changes are reviewed but not yet part of the release trunk</w:t>
             </w:r>
           </w:p>
         </w:tc>
@@ -4615,7 +4615,7 @@
           </w:tcPr>
           <w:p>
             <w:r>
-              <w:t>Draft; review against main</w:t>
+              <w:t>Draft; review against pr-branch</w:t>
             </w:r>
           </w:p>
         </w:tc>
@@ -4634,6 +4634,38 @@
           <w:p>
             <w:r>
               <w:t>Canonical report and deployment-secret fix are published; workflow consolidation remains blocked on workflow-write scope</w:t>
+            </w:r>
+          </w:p>
+        </w:tc>
+      </w:tr>
+      <w:tr>
+        <w:tc>
+          <w:tcPr>
+            <w:tcW w:type="dxa" w:w="2200"/>
+          </w:tcPr>
+          <w:p>
+            <w:r>
+              <w:t>#23</w:t>
+            </w:r>
+          </w:p>
+        </w:tc>
+        <w:tc>
+          <w:tcPr>
+            <w:tcW w:type="dxa" w:w="2400"/>
+          </w:tcPr>
+          <w:p>
+            <w:r>
+              <w:t>Draft canonical integration PR</w:t>
+            </w:r>
+          </w:p>
+        </w:tc>
+        <w:tc>
+          <w:tcPr>
+            <w:tcW w:type="dxa" w:w="4760"/>
+          </w:tcPr>
+          <w:p>
+            <w:r>
+              <w:t>Promotes audited pr-branch to main after focused remediation and release gates</w:t>
             </w:r>
           </w:p>
         </w:tc>

</xml_diff>

<commit_message>
docs: record protected main branch
</commit_message>
<xml_diff>
--- a/docs/SALIS_AUTO_CANONICAL_AUDIT_2026-06-10.docx
+++ b/docs/SALIS_AUTO_CANONICAL_AUDIT_2026-06-10.docx
@@ -656,7 +656,7 @@
           </w:tcPr>
           <w:p>
             <w:r>
-              <w:t>Authoritative release trunk; protection remains required</w:t>
+              <w:t>Protected release trunk with review and current CI requirements</w:t>
             </w:r>
           </w:p>
         </w:tc>
@@ -5577,7 +5577,7 @@
           </w:tcPr>
           <w:p>
             <w:r>
-              <w:t>Protected main, required checks, branch ownership, and one canonical release path</w:t>
+              <w:t>Main protection is enabled; retain check-name migration, branch retirement, and release-procedure evidence</w:t>
             </w:r>
           </w:p>
         </w:tc>

</xml_diff>